<commit_message>
Refina narrativa das ferramentas de pedra
</commit_message>
<xml_diff>
--- a/Biblia Editorial - Historia Viva v1.0.docx
+++ b/Biblia Editorial - Historia Viva v1.0.docx
@@ -2355,6 +2355,38 @@
     <w:p/>
     <w:p>
       <w:pPr>
+        <w:pStyle w:val="Heading2"/>
+      </w:pPr>
+      <w:r>
+        <w:t>6. Mostrar uma cena</w:t>
+      </w:r>
+    </w:p>
+    <w:p>
+      <w:pPr>
+        <w:pStyle w:val="ListBullet"/>
+      </w:pPr>
+      <w:r>
+        <w:t>Cada story block deve conter pelo menos uma cena que possa ser imaginada: alguem escolhe uma pedra, desfere um golpe, corta uma pele, ensina outra pessoa ou hesita antes de decidir.</w:t>
+      </w:r>
+    </w:p>
+    <w:p>
+      <w:pPr>
+        <w:pStyle w:val="Heading2"/>
+      </w:pPr>
+      <w:r>
+        <w:t>7. Criar uma frase de ouro</w:t>
+      </w:r>
+    </w:p>
+    <w:p>
+      <w:pPr>
+        <w:pStyle w:val="ListBullet"/>
+      </w:pPr>
+      <w:r>
+        <w:t>Cada licao deve conter pelo menos uma frase memoravel que o utilizador possa recordar horas depois. Deve ser simples, concreta e ligada ao sentido da licao.</w:t>
+      </w:r>
+    </w:p>
+    <w:p>
+      <w:pPr>
         <w:pStyle w:val="Heading1"/>
       </w:pPr>
       <w:r>
@@ -2463,6 +2495,22 @@
           <w:sz w:val="21"/>
         </w:rPr>
         <w:t>8. Fazer a pergunta final: compreende-se facilmente e imagina-se a cena?</w:t>
+      </w:r>
+    </w:p>
+    <w:p>
+      <w:pPr>
+        <w:pStyle w:val="ListBullet"/>
+      </w:pPr>
+      <w:r>
+        <w:t>9. Confirmar que cada story block contem pelo menos uma cena imaginavel.</w:t>
+      </w:r>
+    </w:p>
+    <w:p>
+      <w:pPr>
+        <w:pStyle w:val="ListBullet"/>
+      </w:pPr>
+      <w:r>
+        <w:t>10. Garantir que a licao tem pelo menos uma frase de ouro.</w:t>
       </w:r>
     </w:p>
     <w:p>

</xml_diff>

<commit_message>
Ajusta densidade dos story blocks
</commit_message>
<xml_diff>
--- a/Biblia Editorial - Historia Viva v1.0.docx
+++ b/Biblia Editorial - Historia Viva v1.0.docx
@@ -2366,7 +2366,7 @@
         <w:pStyle w:val="ListBullet"/>
       </w:pPr>
       <w:r>
-        <w:t>Cada story block deve conter pelo menos uma cena que possa ser imaginada: alguem escolhe uma pedra, desfere um golpe, corta uma pele, ensina outra pessoa ou hesita antes de decidir.</w:t>
+        <w:t>Cada story block deve conter pelo menos uma cena que possa ser imaginada: alguem escolhe uma pedra, desfere um golpe, corta uma pele, ensina outra pessoa ou hesita antes de decidir. Exemplo de referencia: Ao lado, alguem mais experiente mostrava o angulo, o ritmo e a paciencia.</w:t>
       </w:r>
     </w:p>
     <w:p>
@@ -2425,11 +2425,7 @@
         <w:spacing w:after="60" w:line="276" w:lineRule="auto"/>
       </w:pPr>
       <w:r>
-        <w:rPr>
-          <w:rFonts w:ascii="Calibri" w:hAnsi="Calibri"/>
-          <w:sz w:val="21"/>
-        </w:rPr>
-        <w:t>3. Escrever um paragrafo de 50 a 75 palavras.</w:t>
+        <w:t>3. Escrever um paragrafo de 45 a 55 palavras.</w:t>
       </w:r>
     </w:p>
     <w:p>

</xml_diff>

<commit_message>
Aplica Biblia Editorial em desktop e mobile
</commit_message>
<xml_diff>
--- a/Biblia Editorial - Historia Viva v1.0.docx
+++ b/Biblia Editorial - Historia Viva v1.0.docx
@@ -2387,6 +2387,22 @@
     </w:p>
     <w:p>
       <w:pPr>
+        <w:pStyle w:val="Heading2"/>
+      </w:pPr>
+      <w:r>
+        <w:t>8. Aplicar a mesma regra em desktop e mobile</w:t>
+      </w:r>
+    </w:p>
+    <w:p>
+      <w:pPr>
+        <w:pStyle w:val="ListBullet"/>
+      </w:pPr>
+      <w:r>
+        <w:t>Desktop e mobile devem obedecer aos mesmos principios editoriais: cena concreta, imagem mental, consequencia clara e frase memoravel. A diferenca esta na composicao visual: no desktop, a imagem respira em largura; no mobile, a UI retira ruido e mantem o texto com medida curta.</w:t>
+      </w:r>
+    </w:p>
+    <w:p>
+      <w:pPr>
         <w:pStyle w:val="Heading1"/>
       </w:pPr>
       <w:r>
@@ -2506,7 +2522,7 @@
         <w:pStyle w:val="ListBullet"/>
       </w:pPr>
       <w:r>
-        <w:t>10. Garantir que a licao tem pelo menos uma frase de ouro.</w:t>
+        <w:t>10. Garantir que a licao tem pelo menos uma frase de ouro. Confirmar tambem que a composicao funciona como descoberta em desktop e mobile.</w:t>
       </w:r>
     </w:p>
     <w:p>

</xml_diff>

<commit_message>
Uniformiza story e post-story blocks
</commit_message>
<xml_diff>
--- a/Biblia Editorial - Historia Viva v1.0.docx
+++ b/Biblia Editorial - Historia Viva v1.0.docx
@@ -3057,6 +3057,127 @@
         </w:tc>
       </w:tr>
     </w:tbl>
+    <w:p>
+      <w:pPr>
+        <w:pStyle w:val="Heading3"/>
+      </w:pPr>
+      <w:r>
+        <w:t>29. Manter Continuidade Entre Story Blocks e Post-Story Blocks</w:t>
+      </w:r>
+    </w:p>
+    <w:p>
+      <w:r>
+        <w:t>Os post-story blocks n?o devem parecer um resumo separado da li??o. Devem continuar a mesma experi?ncia editorial dos story blocks.</w:t>
+      </w:r>
+    </w:p>
+    <w:p>
+      <w:r>
+        <w:t>A sequ?ncia ideal ?:</w:t>
+      </w:r>
+    </w:p>
+    <w:p>
+      <w:pPr>
+        <w:pStyle w:val="ListBullet"/>
+      </w:pPr>
+      <w:r>
+        <w:t>Story blocks: mostram a cena, o gesto, o problema e a consequ?ncia.</w:t>
+      </w:r>
+    </w:p>
+    <w:p>
+      <w:pPr>
+        <w:pStyle w:val="ListBullet"/>
+      </w:pPr>
+      <w:r>
+        <w:t>Reflex?o: pergunta o que ficou diferente depois da cena.</w:t>
+      </w:r>
+    </w:p>
+    <w:p>
+      <w:pPr>
+        <w:pStyle w:val="ListBullet"/>
+      </w:pPr>
+      <w:r>
+        <w:t>Guia de assimila??o: ajuda a ler as pistas deixadas por objetos, marcas, ossos, cinzas, paredes, caminhos ou ferramentas.</w:t>
+      </w:r>
+    </w:p>
+    <w:p>
+      <w:pPr>
+        <w:pStyle w:val="ListBullet"/>
+      </w:pPr>
+      <w:r>
+        <w:t>Ponte ao presente: mostra uma descend?ncia distante do mesmo gesto humano.</w:t>
+      </w:r>
+    </w:p>
+    <w:p>
+      <w:pPr>
+        <w:pStyle w:val="ListBullet"/>
+      </w:pPr>
+      <w:r>
+        <w:t>Lente cr?tica: pergunta quem ganhou, quem perdeu, quem trabalhou, quem ficou de fora ou quem pagou o custo.</w:t>
+      </w:r>
+    </w:p>
+    <w:p>
+      <w:pPr>
+        <w:pStyle w:val="ListBullet"/>
+      </w:pPr>
+      <w:r>
+        <w:t>Desafio: obriga o utilizador a decidir pela cena, pelos vest?gios e pela consequ?ncia.</w:t>
+      </w:r>
+    </w:p>
+    <w:p>
+      <w:r>
+        <w:t>Regras:</w:t>
+      </w:r>
+    </w:p>
+    <w:p>
+      <w:pPr>
+        <w:pStyle w:val="ListBullet"/>
+      </w:pPr>
+      <w:r>
+        <w:t>Usar a mesma linguagem concreta dos story blocks.</w:t>
+      </w:r>
+    </w:p>
+    <w:p>
+      <w:pPr>
+        <w:pStyle w:val="ListBullet"/>
+      </w:pPr>
+      <w:r>
+        <w:t>Manter pelo menos uma imagem mental em cada post-story block.</w:t>
+      </w:r>
+    </w:p>
+    <w:p>
+      <w:pPr>
+        <w:pStyle w:val="ListBullet"/>
+      </w:pPr>
+      <w:r>
+        <w:t>Evitar tom de painel explicativo ou resumo de manual.</w:t>
+      </w:r>
+    </w:p>
+    <w:p>
+      <w:pPr>
+        <w:pStyle w:val="ListBullet"/>
+      </w:pPr>
+      <w:r>
+        <w:t>Preferir palavras como gesto, pista, marca, cena, consequ?ncia, cuidado, risco e presente.</w:t>
+      </w:r>
+    </w:p>
+    <w:p>
+      <w:pPr>
+        <w:pStyle w:val="ListBullet"/>
+      </w:pPr>
+      <w:r>
+        <w:t>Em mobile, nunca cortar texto essencial dos cart?es de assimila??o, realidade ou lente cr?tica.</w:t>
+      </w:r>
+    </w:p>
+    <w:p>
+      <w:r>
+        <w:t>Exemplo: Ao lado, algu?m mais experiente mostrava o ?ngulo, o ritmo e a paci?ncia.</w:t>
+      </w:r>
+    </w:p>
+    <w:p>
+      <w:r>
+        <w:t>Continua??o poss?vel: Milhares de anos depois, as marcas nas lascas ainda revelam esses gestos.</w:t>
+      </w:r>
+    </w:p>
     <w:sectPr>
       <w:footerReference w:type="default" r:id="rId9"/>
       <w:pgSz w:w="12240" w:h="15840"/>

</xml_diff>